<commit_message>
docs(catalog): retire VIP pricing from scope
</commit_message>
<xml_diff>
--- a/docs/catalog-category-expansion/CLIENT_REQUIREMENTS_AND_UI_DESIGN.docx
+++ b/docs/catalog-category-expansion/CLIENT_REQUIREMENTS_AND_UI_DESIGN.docx
@@ -2318,6 +2318,74 @@
     </w:p>
     <w:p>
       <w:pPr>
+        <w:ind w:left="720" w:first-line="-720"/>
+      </w:pPr>
+      <w:r>
+        <w:rPr>
+          <w:rFonts w:ascii="PingFang SC" w:hAnsi="PingFang SC" w:cs="PingFang SC"/>
+          <w:sz w:val="29"/>
+          <w:sz-cs w:val="29"/>
+          <w:color w:val="121826"/>
+        </w:rPr>
+        <w:t xml:space="preserve"/>
+        <w:tab/>
+        <w:t xml:space="preserve">•</w:t>
+        <w:tab/>
+        <w:t xml:space="preserve"/>
+      </w:r>
+      <w:r>
+        <w:rPr>
+          <w:rFonts w:ascii="PingFang SC" w:hAnsi="PingFang SC" w:cs="PingFang SC"/>
+          <w:sz w:val="29"/>
+          <w:sz-cs w:val="29"/>
+          <w:spacing w:val="0"/>
+          <w:color w:val="121826"/>
+        </w:rPr>
+        <w:t xml:space="preserve">本期后台商品表单不显示 VIP Price，不新增或修改会员价格。</w:t>
+      </w:r>
+    </w:p>
+    <w:p>
+      <w:pPr>
+        <w:spacing w:after="346"/>
+      </w:pPr>
+      <w:r>
+        <w:rPr>
+          <w:rFonts w:ascii="PingFang SC Semibold" w:hAnsi="PingFang SC Semibold" w:cs="PingFang SC Semibold"/>
+          <w:sz w:val="34"/>
+          <w:sz-cs w:val="34"/>
+          <w:b/>
+          <w:spacing w:val="0"/>
+          <w:color w:val="1B2B51"/>
+        </w:rPr>
+        <w:t xml:space="preserve">3. VIP 价格处理</w:t>
+      </w:r>
+    </w:p>
+    <w:p>
+      <w:pPr/>
+      <w:r>
+        <w:rPr>
+          <w:rFonts w:ascii="PingFang SC Semibold" w:hAnsi="PingFang SC Semibold" w:cs="PingFang SC Semibold"/>
+          <w:sz w:val="29"/>
+          <w:sz-cs w:val="29"/>
+          <w:b/>
+          <w:spacing w:val="0"/>
+          <w:color w:val="121826"/>
+        </w:rPr>
+        <w:t xml:space="preserve">本期不继续建设 VIP 价格功能：</w:t>
+      </w:r>
+      <w:r>
+        <w:rPr>
+          <w:rFonts w:ascii="PingFang SC" w:hAnsi="PingFang SC" w:cs="PingFang SC"/>
+          <w:sz w:val="29"/>
+          <w:sz-cs w:val="29"/>
+          <w:spacing w:val="0"/>
+          <w:color w:val="121826"/>
+        </w:rPr>
+        <w:t xml:space="preserve">商品卡、分类页和 SKU 页面不显示 VIP 价格，也不显示“登录后查看 VIP 价格”。后台表单隐藏 VIP Price。系统底层的旧字段暂时保留，只为了兼容历史数据；Alibaba 价格接入稳定后再单独清理。</w:t>
+      </w:r>
+    </w:p>
+    <w:p>
+      <w:pPr>
         <w:spacing w:after="376"/>
       </w:pPr>
       <w:r>
@@ -2934,6 +3002,19 @@
           <w:spacing w:val="0"/>
           <w:color w:val="121826"/>
         </w:rPr>
+        <w:t xml:space="preserve">VIP 申请、审批、升级和会员价格展示</w:t>
+      </w:r>
+    </w:p>
+    <w:p>
+      <w:pPr/>
+      <w:r>
+        <w:rPr>
+          <w:rFonts w:ascii="PingFang SC" w:hAnsi="PingFang SC" w:cs="PingFang SC"/>
+          <w:sz w:val="29"/>
+          <w:sz-cs w:val="29"/>
+          <w:spacing w:val="0"/>
+          <w:color w:val="121826"/>
+        </w:rPr>
         <w:t xml:space="preserve"/>
       </w:r>
     </w:p>
@@ -3619,20 +3700,20 @@
           <w:spacing w:val="0"/>
           <w:color w:val="121826"/>
         </w:rPr>
-        <w:t xml:space="preserve">价格查看权限</w:t>
-      </w:r>
-    </w:p>
-    <w:p>
-      <w:pPr/>
-      <w:r>
-        <w:rPr>
-          <w:rFonts w:ascii="PingFang SC" w:hAnsi="PingFang SC" w:cs="PingFang SC"/>
-          <w:sz w:val="29"/>
-          <w:sz-cs w:val="29"/>
-          <w:spacing w:val="0"/>
-          <w:color w:val="121826"/>
-        </w:rPr>
-        <w:t xml:space="preserve">继续沿用当前公开价、批发价和会员价规则</w:t>
+        <w:t xml:space="preserve">价格展示</w:t>
+      </w:r>
+    </w:p>
+    <w:p>
+      <w:pPr/>
+      <w:r>
+        <w:rPr>
+          <w:rFonts w:ascii="PingFang SC" w:hAnsi="PingFang SC" w:cs="PingFang SC"/>
+          <w:sz w:val="29"/>
+          <w:sz-cs w:val="29"/>
+          <w:spacing w:val="0"/>
+          <w:color w:val="121826"/>
+        </w:rPr>
+        <w:t xml:space="preserve">显示允许公开的价格；没有公开价格时显示 Request a quote。本期不显示 VIP 价格</w:t>
       </w:r>
     </w:p>
     <w:p>

</xml_diff>

<commit_message>
docs(catalog): plan low-risk storefront phase
</commit_message>
<xml_diff>
--- a/docs/catalog-category-expansion/CLIENT_REQUIREMENTS_AND_UI_DESIGN.docx
+++ b/docs/catalog-category-expansion/CLIENT_REQUIREMENTS_AND_UI_DESIGN.docx
@@ -180,6 +180,195 @@
           <w:spacing w:val="0"/>
           <w:color w:val="1B2B51"/>
         </w:rPr>
+        <w:t xml:space="preserve">建议实施顺序</w:t>
+      </w:r>
+    </w:p>
+    <w:p>
+      <w:pPr/>
+      <w:r>
+        <w:rPr>
+          <w:rFonts w:ascii="PingFang SC Semibold" w:hAnsi="PingFang SC Semibold" w:cs="PingFang SC Semibold"/>
+          <w:sz w:val="29"/>
+          <w:sz-cs w:val="29"/>
+          <w:b/>
+          <w:spacing w:val="0"/>
+          <w:color w:val="FFFFFF"/>
+        </w:rPr>
+        <w:t xml:space="preserve">Phase 1：先实现</w:t>
+      </w:r>
+    </w:p>
+    <w:p>
+      <w:pPr/>
+      <w:r>
+        <w:rPr>
+          <w:rFonts w:ascii="PingFang SC Semibold" w:hAnsi="PingFang SC Semibold" w:cs="PingFang SC Semibold"/>
+          <w:sz w:val="29"/>
+          <w:sz-cs w:val="29"/>
+          <w:b/>
+          <w:spacing w:val="0"/>
+          <w:color w:val="FFFFFF"/>
+        </w:rPr>
+        <w:t xml:space="preserve">客户确认后再实现</w:t>
+      </w:r>
+    </w:p>
+    <w:p>
+      <w:pPr/>
+      <w:r>
+        <w:rPr>
+          <w:rFonts w:ascii="PingFang SC" w:hAnsi="PingFang SC" w:cs="PingFang SC"/>
+          <w:sz w:val="29"/>
+          <w:sz-cs w:val="29"/>
+          <w:spacing w:val="0"/>
+          <w:color w:val="121826"/>
+        </w:rPr>
+        <w:t xml:space="preserve">桌面与手机菜单</w:t>
+      </w:r>
+    </w:p>
+    <w:p>
+      <w:pPr/>
+      <w:r>
+        <w:rPr>
+          <w:rFonts w:ascii="PingFang SC" w:hAnsi="PingFang SC" w:cs="PingFang SC"/>
+          <w:sz w:val="29"/>
+          <w:sz-cs w:val="29"/>
+          <w:spacing w:val="0"/>
+          <w:color w:val="121826"/>
+        </w:rPr>
+        <w:t xml:space="preserve">Electronics &amp; Toys 基础总览</w:t>
+      </w:r>
+    </w:p>
+    <w:p>
+      <w:pPr/>
+      <w:r>
+        <w:rPr>
+          <w:rFonts w:ascii="PingFang SC" w:hAnsi="PingFang SC" w:cs="PingFang SC"/>
+          <w:sz w:val="29"/>
+          <w:sz-cs w:val="29"/>
+          <w:spacing w:val="0"/>
+          <w:color w:val="121826"/>
+        </w:rPr>
+        <w:t xml:space="preserve">三个新分类的准备中页面</w:t>
+      </w:r>
+    </w:p>
+    <w:p>
+      <w:pPr/>
+      <w:r>
+        <w:rPr>
+          <w:rFonts w:ascii="PingFang SC" w:hAnsi="PingFang SC" w:cs="PingFang SC"/>
+          <w:sz w:val="29"/>
+          <w:sz-cs w:val="29"/>
+          <w:spacing w:val="0"/>
+          <w:color w:val="121826"/>
+        </w:rPr>
+        <w:t xml:space="preserve">现有 Headphones 与本地示例商品 UI 验证</w:t>
+      </w:r>
+    </w:p>
+    <w:p>
+      <w:pPr/>
+      <w:r>
+        <w:rPr>
+          <w:rFonts w:ascii="PingFang SC" w:hAnsi="PingFang SC" w:cs="PingFang SC"/>
+          <w:sz w:val="29"/>
+          <w:sz-cs w:val="29"/>
+          <w:spacing w:val="0"/>
+          <w:color w:val="121826"/>
+        </w:rPr>
+        <w:t xml:space="preserve">前台隐藏 VIP 价格入口</w:t>
+      </w:r>
+    </w:p>
+    <w:p>
+      <w:pPr/>
+      <w:r>
+        <w:rPr>
+          <w:rFonts w:ascii="PingFang SC" w:hAnsi="PingFang SC" w:cs="PingFang SC"/>
+          <w:sz w:val="29"/>
+          <w:sz-cs w:val="29"/>
+          <w:spacing w:val="0"/>
+          <w:color w:val="121826"/>
+        </w:rPr>
+        <w:t xml:space="preserve">跨分类真实商品数据与 Alibaba mapping</w:t>
+      </w:r>
+    </w:p>
+    <w:p>
+      <w:pPr/>
+      <w:r>
+        <w:rPr>
+          <w:rFonts w:ascii="PingFang SC" w:hAnsi="PingFang SC" w:cs="PingFang SC"/>
+          <w:sz w:val="29"/>
+          <w:sz-cs w:val="29"/>
+          <w:spacing w:val="0"/>
+          <w:color w:val="121826"/>
+        </w:rPr>
+        <w:t xml:space="preserve">Admin 分类 Tab 与商品表单改造</w:t>
+      </w:r>
+    </w:p>
+    <w:p>
+      <w:pPr/>
+      <w:r>
+        <w:rPr>
+          <w:rFonts w:ascii="PingFang SC" w:hAnsi="PingFang SC" w:cs="PingFang SC"/>
+          <w:sz w:val="29"/>
+          <w:sz-cs w:val="29"/>
+          <w:spacing w:val="0"/>
+          <w:color w:val="121826"/>
+        </w:rPr>
+        <w:t xml:space="preserve">SKU 独立页面和永久 URL</w:t>
+      </w:r>
+    </w:p>
+    <w:p>
+      <w:pPr/>
+      <w:r>
+        <w:rPr>
+          <w:rFonts w:ascii="PingFang SC" w:hAnsi="PingFang SC" w:cs="PingFang SC"/>
+          <w:sz w:val="29"/>
+          <w:sz-cs w:val="29"/>
+          <w:spacing w:val="0"/>
+          <w:color w:val="121826"/>
+        </w:rPr>
+        <w:t xml:space="preserve">Breadcrumb、Product Schema 与完整 SEO 接入</w:t>
+      </w:r>
+    </w:p>
+    <w:p>
+      <w:pPr/>
+      <w:r>
+        <w:rPr>
+          <w:rFonts w:ascii="PingFang SC" w:hAnsi="PingFang SC" w:cs="PingFang SC"/>
+          <w:sz w:val="29"/>
+          <w:sz-cs w:val="29"/>
+          <w:spacing w:val="0"/>
+          <w:color w:val="121826"/>
+        </w:rPr>
+        <w:t xml:space="preserve">发布权限、删除和批量操作</w:t>
+      </w:r>
+    </w:p>
+    <w:p>
+      <w:pPr>
+        <w:spacing w:after="160"/>
+      </w:pPr>
+      <w:r>
+        <w:rPr>
+          <w:rFonts w:ascii="PingFang SC" w:hAnsi="PingFang SC" w:cs="PingFang SC"/>
+          <w:sz w:val="25"/>
+          <w:sz-cs w:val="25"/>
+          <w:spacing w:val="0"/>
+          <w:color w:val="556277"/>
+        </w:rPr>
+        <w:t xml:space="preserve">Phase 1 的新分类名称和页面地址只用于本地或受控测试预览；客户确认前不发布到生产。</w:t>
+      </w:r>
+    </w:p>
+    <w:p>
+      <w:pPr>
+        <w:spacing w:after="346"/>
+      </w:pPr>
+      <w:r>
+        <w:rPr>
+          <w:rFonts w:ascii="PingFang SC Semibold" w:hAnsi="PingFang SC Semibold" w:cs="PingFang SC Semibold"/>
+          <w:sz w:val="34"/>
+          <w:sz-cs w:val="34"/>
+          <w:b/>
+          <w:spacing w:val="0"/>
+          <w:color w:val="1B2B51"/>
+        </w:rPr>
         <w:t xml:space="preserve">建议的商品层级</w:t>
       </w:r>
     </w:p>
@@ -748,13 +937,50 @@
       </w:pPr>
       <w:r>
         <w:rPr>
-          <w:rFonts w:ascii="PingFang SC" w:hAnsi="PingFang SC" w:cs="PingFang SC"/>
-          <w:sz w:val="29"/>
-          <w:sz-cs w:val="29"/>
-          <w:spacing w:val="0"/>
-          <w:color w:val="121826"/>
-        </w:rPr>
-        <w:t xml:space="preserve">总览页让客户先选择产品大类，同时展示少量重点商品。它是商品目录入口，不做成大段营销 Landing Page。</w:t>
+          <w:rFonts w:ascii="PingFang SC Semibold" w:hAnsi="PingFang SC Semibold" w:cs="PingFang SC Semibold"/>
+          <w:sz w:val="29"/>
+          <w:sz-cs w:val="29"/>
+          <w:b/>
+          <w:spacing w:val="0"/>
+          <w:color w:val="121826"/>
+        </w:rPr>
+        <w:t xml:space="preserve">Phase 1：</w:t>
+      </w:r>
+      <w:r>
+        <w:rPr>
+          <w:rFonts w:ascii="PingFang SC" w:hAnsi="PingFang SC" w:cs="PingFang SC"/>
+          <w:sz w:val="29"/>
+          <w:sz-cs w:val="29"/>
+          <w:spacing w:val="0"/>
+          <w:color w:val="121826"/>
+        </w:rPr>
+        <w:t xml:space="preserve">总览页先提供四个无产品图的文字分类入口；Headphones 标记为可浏览，其他三类标记为准备中。</w:t>
+      </w:r>
+    </w:p>
+    <w:p>
+      <w:pPr>
+        <w:spacing w:after="320"/>
+      </w:pPr>
+      <w:r>
+        <w:rPr>
+          <w:rFonts w:ascii="PingFang SC Semibold" w:hAnsi="PingFang SC Semibold" w:cs="PingFang SC Semibold"/>
+          <w:sz w:val="29"/>
+          <w:sz-cs w:val="29"/>
+          <w:b/>
+          <w:spacing w:val="0"/>
+          <w:color w:val="121826"/>
+        </w:rPr>
+        <w:t xml:space="preserve">以下带图片、Breadcrumb 和 Featured Products 的线框是客户确认内容后的后续完整版，不属于 Phase 1。</w:t>
+      </w:r>
+      <w:r>
+        <w:rPr>
+          <w:rFonts w:ascii="PingFang SC" w:hAnsi="PingFang SC" w:cs="PingFang SC"/>
+          <w:sz w:val="29"/>
+          <w:sz-cs w:val="29"/>
+          <w:spacing w:val="0"/>
+          <w:color w:val="121826"/>
+        </w:rPr>
+        <w:t xml:space="preserve"/>
       </w:r>
     </w:p>
     <w:p>
@@ -1052,13 +1278,50 @@
       </w:pPr>
       <w:r>
         <w:rPr>
-          <w:rFonts w:ascii="PingFang SC" w:hAnsi="PingFang SC" w:cs="PingFang SC"/>
-          <w:sz w:val="29"/>
-          <w:sz-cs w:val="29"/>
-          <w:spacing w:val="0"/>
-          <w:color w:val="121826"/>
-        </w:rPr>
-        <w:t xml:space="preserve">四个产品大类共用同一种页面布局，但每个大类使用自己的标题、图片和介绍。Headphones 继续保留 Office、Bluetooth、Wired 筛选。</w:t>
+          <w:rFonts w:ascii="PingFang SC Semibold" w:hAnsi="PingFang SC Semibold" w:cs="PingFang SC Semibold"/>
+          <w:sz w:val="29"/>
+          <w:sz-cs w:val="29"/>
+          <w:b/>
+          <w:spacing w:val="0"/>
+          <w:color w:val="121826"/>
+        </w:rPr>
+        <w:t xml:space="preserve">Phase 1：</w:t>
+      </w:r>
+      <w:r>
+        <w:rPr>
+          <w:rFonts w:ascii="PingFang SC" w:hAnsi="PingFang SC" w:cs="PingFang SC"/>
+          <w:sz w:val="29"/>
+          <w:sz-cs w:val="29"/>
+          <w:spacing w:val="0"/>
+          <w:color w:val="121826"/>
+        </w:rPr>
+        <w:t xml:space="preserve">Headphones 保持当前商品列表和详情交互；其他三类只显示准备中说明与询价按钮。</w:t>
+      </w:r>
+    </w:p>
+    <w:p>
+      <w:pPr>
+        <w:spacing w:after="320"/>
+      </w:pPr>
+      <w:r>
+        <w:rPr>
+          <w:rFonts w:ascii="PingFang SC Semibold" w:hAnsi="PingFang SC Semibold" w:cs="PingFang SC Semibold"/>
+          <w:sz w:val="29"/>
+          <w:sz-cs w:val="29"/>
+          <w:b/>
+          <w:spacing w:val="0"/>
+          <w:color w:val="121826"/>
+        </w:rPr>
+        <w:t xml:space="preserve">以下商品网格、筛选、详情链接和分页是后续真实数据/API 阶段的设计方向，不属于 Phase 1。</w:t>
+      </w:r>
+      <w:r>
+        <w:rPr>
+          <w:rFonts w:ascii="PingFang SC" w:hAnsi="PingFang SC" w:cs="PingFang SC"/>
+          <w:sz w:val="29"/>
+          <w:sz-cs w:val="29"/>
+          <w:spacing w:val="0"/>
+          <w:color w:val="121826"/>
+        </w:rPr>
+        <w:t xml:space="preserve"/>
       </w:r>
     </w:p>
     <w:p>

</xml_diff>